<commit_message>
Close F-1 in flow review: clone path Id handling verified working via debug
Co-Authored-By: Claude Fable 5 <noreply@anthropic.com>
Claude-Session: https://claude.ai/code/session_01LikXTiVDyR24xCRvYkrPvc
</commit_message>
<xml_diff>
--- a/docs/Money_Management_Assessment_TX_Flow_Review.docx
+++ b/docs/Money_Management_Assessment_TX_Flow_Review.docx
@@ -21,7 +21,7 @@
         </w:rPr>
         <w:t>Screen Flow review — findings and optimization recommendations</w:t>
         <w:br/>
-        <w:t>Flow API Version 63.0  |  Review date: July 3, 2026  |  Reviewed against: current org metadata (XML)</w:t>
+        <w:t>Flow API Version 63.0  |  Review date: July 3, 2026 (rev. 2 — F-1 closed after debug verification)  |  Reviewed against: current org metadata (XML)</w:t>
       </w:r>
     </w:p>
     <w:p>
@@ -59,7 +59,7 @@
           <w:b w:val="0"/>
           <w:i w:val="0"/>
         </w:rPr>
-        <w:t>Beyond that, the review found one high-risk defect on the clone path (record Id is never cleared before the Create Records element), one resilience gap (the draft-save update has no fault path), one wasted query (Get Admission Record is never used), and a few smaller consistency items. Findings are ranked in Section 4.</w:t>
+        <w:t>Beyond that, the review examined the clone path's handling of the copied record Id (initially flagged as a risk, then verified working via a debug run — Flow's Create Records element ignores the incoming Id and treats that field as an output; see F-1), and found one resilience gap (the draft-save update has no fault path), one wasted query (Get Admission Record is never used), and a few smaller consistency items. Findings are ranked in Section 4.</w:t>
       </w:r>
     </w:p>
     <w:p>
@@ -287,7 +287,7 @@
         <w:rPr>
           <w:color w:val="1F3B57"/>
         </w:rPr>
-        <w:t>F-1. Clone path: record Id is never cleared before Create Records</w:t>
+        <w:t>F-1. Clone path: record Id handling — VERIFIED WORKING (closed)</w:t>
       </w:r>
     </w:p>
     <w:p>
@@ -300,9 +300,9 @@
       <w:r>
         <w:rPr>
           <w:b/>
-          <w:color w:val="B03030"/>
+          <w:color w:val="2E7D32"/>
         </w:rPr>
-        <w:t>HIGH — likely runtime failure on Path 3</w:t>
+        <w:t>CLOSED — verified by debug; no action needed</w:t>
       </w:r>
     </w:p>
     <w:p>
@@ -311,7 +311,7 @@
           <w:b w:val="0"/>
           <w:i w:val="0"/>
         </w:rPr>
-        <w:t>Existing Record Variables copies the entire retrieved record into form_document_record — including its Id. On the clone path (Check for Draft Status → default outcome), that variable flows straight into Create_Document_Record. An insert of an sObject that already has an Id fails ("cannot specify Id in an insert call"), which would send the user to the Error Screen.</w:t>
+        <w:t>Initial review flagged that Existing Record Variables copies the retrieved record's Id into form_document_record, which then flows into Create_Document_Record on the clone path — a pattern that fails in Apex ("cannot specify Id in an insert call"). A debug run cloning a generated form document confirmed the clone succeeds. The reason is a Flow-specific behavior: the Create Records element treats the record variable's Id field as an OUTPUT, not an input. The incoming Id value is never sent with the insert; after the insert succeeds, Flow overwrites that field with the new record's Id.</w:t>
       </w:r>
     </w:p>
     <w:p>
@@ -320,25 +320,7 @@
           <w:b w:val="0"/>
           <w:i w:val="0"/>
         </w:rPr>
-        <w:t>This is very likely a regression introduced by the (otherwise good) whole-record optimization: the old field-by-field copy never touched Id or the audit fields, so no clearing was needed. After switching to the whole-record assign, CreatedDate and LastModifiedDate were blanked to fix the insert — but Id was not, and the same reasoning applies to it even more strongly. CreatedById and LastModifiedById are audit fields in the same category and may also need clearing if they come back populated by the Get.</w:t>
-      </w:r>
-    </w:p>
-    <w:p>
-      <w:r>
-        <w:rPr>
-          <w:b/>
-          <w:i w:val="0"/>
-        </w:rPr>
-        <w:t>Important constraint: do NOT clear Id inside Existing Record Variables itself. That element is shared with the draft-resume path, and Update_Record_One requires the Id to update the existing draft. Clearing it there would break Path 2.</w:t>
-      </w:r>
-    </w:p>
-    <w:p>
-      <w:r>
-        <w:rPr>
-          <w:b/>
-          <w:i w:val="0"/>
-        </w:rPr>
-        <w:t>Recommendation:</w:t>
+        <w:t>Three related observations from closing this finding:</w:t>
       </w:r>
     </w:p>
     <w:p>
@@ -346,7 +328,7 @@
         <w:pStyle w:val="ListBullet"/>
       </w:pPr>
       <w:r>
-        <w:t>Add a small assignment element (e.g. "Clear Clone Fields") on the DEFAULT outcome of Check for Draft Status, between the decision and Create_Document_Record, that blanks: Id, CreatedById, LastModifiedById (CreatedDate and LastModifiedDate are already handled upstream and can optionally be moved here, since only the clone path needs them cleared).</w:t>
+        <w:t>The blank CreatedDate / LastModifiedDate rows in Existing Record Variables are load-bearing and must stay. Audit fields do NOT get the special treatment Id gets — if they reach a Create Records element populated, the insert fails with INVALID_FIELD_FOR_INSERT_UPDATE.</w:t>
       </w:r>
     </w:p>
     <w:p>
@@ -354,7 +336,7 @@
         <w:pStyle w:val="ListBullet"/>
       </w:pPr>
       <w:r>
-        <w:t>Test Path 3 end-to-end in a sandbox: open the flow with a formDocId pointing at a Submitted record and confirm a new Draft record is created rather than hitting the Error Screen.</w:t>
+        <w:t>CreatedById / LastModifiedById are not a risk: the Get uses automatic output storage, which only queries fields referenced somewhere in the flow. Those fields are referenced nowhere, so they never enter the record variable.</w:t>
       </w:r>
     </w:p>
     <w:p>
@@ -362,7 +344,16 @@
         <w:pStyle w:val="ListBullet"/>
       </w:pPr>
       <w:r>
-        <w:t>Decide deliberately about OwnerId: because the flow runs in SystemModeWithoutSharing, a clone currently keeps the original document's owner. If the cloning user should own the new draft, blank OwnerId in the same element (or set it to $User.Id).</w:t>
+        <w:t>After the clone's Create runs, form_document_record.Id holds the NEW record's Id — which is why the subsequent Save Draft (Update_Record_One) correctly updates the clone rather than the source document. The design is coherent end-to-end.</w:t>
+      </w:r>
+    </w:p>
+    <w:p>
+      <w:r>
+        <w:rPr>
+          <w:b w:val="0"/>
+          <w:i/>
+        </w:rPr>
+        <w:t>Residual consideration (optional): because OwnerId is never queried or copied, a cloned document is owned by the user who ran the flow. That is a sensible default; noted here only so it is a documented decision.</w:t>
       </w:r>
     </w:p>
     <w:p>
@@ -728,48 +719,6 @@
           </w:tcPr>
           <w:p>
             <w:r>
-              <w:t>F-1  Clear Id (and audit user fields) on the clone path, then test Path 3</w:t>
-            </w:r>
-          </w:p>
-        </w:tc>
-        <w:tc>
-          <w:tcPr>
-            <w:tcW w:type="dxa" w:w="2160"/>
-          </w:tcPr>
-          <w:p>
-            <w:r>
-              <w:t>Small</w:t>
-            </w:r>
-          </w:p>
-        </w:tc>
-        <w:tc>
-          <w:tcPr>
-            <w:tcW w:type="dxa" w:w="2160"/>
-          </w:tcPr>
-          <w:p>
-            <w:r>
-              <w:t>Clone feature fails at runtime</w:t>
-            </w:r>
-          </w:p>
-        </w:tc>
-      </w:tr>
-      <w:tr>
-        <w:tc>
-          <w:tcPr>
-            <w:tcW w:type="dxa" w:w="2160"/>
-          </w:tcPr>
-          <w:p>
-            <w:r>
-              <w:t>2</w:t>
-            </w:r>
-          </w:p>
-        </w:tc>
-        <w:tc>
-          <w:tcPr>
-            <w:tcW w:type="dxa" w:w="2160"/>
-          </w:tcPr>
-          <w:p>
-            <w:r>
               <w:t>F-2  Fault connector on Update_Record_One</w:t>
             </w:r>
           </w:p>
@@ -802,7 +751,7 @@
           </w:tcPr>
           <w:p>
             <w:r>
-              <w:t>3</w:t>
+              <w:t>2</w:t>
             </w:r>
           </w:p>
         </w:tc>
@@ -844,7 +793,7 @@
           </w:tcPr>
           <w:p>
             <w:r>
-              <w:t>4</w:t>
+              <w:t>3</w:t>
             </w:r>
           </w:p>
         </w:tc>
@@ -886,7 +835,7 @@
           </w:tcPr>
           <w:p>
             <w:r>
-              <w:t>5</w:t>
+              <w:t>4</w:t>
             </w:r>
           </w:p>
         </w:tc>
@@ -928,7 +877,7 @@
           </w:tcPr>
           <w:p>
             <w:r>
-              <w:t>6</w:t>
+              <w:t>5</w:t>
             </w:r>
           </w:p>
         </w:tc>
@@ -970,7 +919,7 @@
           </w:tcPr>
           <w:p>
             <w:r>
-              <w:t>7</w:t>
+              <w:t>6</w:t>
             </w:r>
           </w:p>
         </w:tc>
@@ -1005,6 +954,48 @@
           </w:p>
         </w:tc>
       </w:tr>
+      <w:tr>
+        <w:tc>
+          <w:tcPr>
+            <w:tcW w:type="dxa" w:w="2160"/>
+          </w:tcPr>
+          <w:p>
+            <w:r>
+              <w:t>—</w:t>
+            </w:r>
+          </w:p>
+        </w:tc>
+        <w:tc>
+          <w:tcPr>
+            <w:tcW w:type="dxa" w:w="2160"/>
+          </w:tcPr>
+          <w:p>
+            <w:r>
+              <w:t>F-1  Clone path Id handling</w:t>
+            </w:r>
+          </w:p>
+        </w:tc>
+        <w:tc>
+          <w:tcPr>
+            <w:tcW w:type="dxa" w:w="2160"/>
+          </w:tcPr>
+          <w:p>
+            <w:r>
+              <w:t>None</w:t>
+            </w:r>
+          </w:p>
+        </w:tc>
+        <w:tc>
+          <w:tcPr>
+            <w:tcW w:type="dxa" w:w="2160"/>
+          </w:tcPr>
+          <w:p>
+            <w:r>
+              <w:t>Closed — verified working via debug</w:t>
+            </w:r>
+          </w:p>
+        </w:tc>
+      </w:tr>
     </w:tbl>
     <w:p/>
     <w:p>
@@ -1013,7 +1004,7 @@
           <w:b w:val="0"/>
           <w:i/>
         </w:rPr>
-        <w:t>Items 1–3 change runtime behavior and should each be verified in a sandbox with all three paths: new + save draft, resume draft + submit, and clone from a submitted document.</w:t>
+        <w:t>Items 1–2 change runtime behavior and should each be verified in a sandbox with all three paths: new + save draft, resume draft + submit, and clone from a submitted document. F-1 was verified working via a debug run and requires no change.</w:t>
       </w:r>
     </w:p>
     <w:sectPr>

</xml_diff>

<commit_message>
Expand F-6 in flow review: completeness-gate intent and declarative alternative
Co-Authored-By: Claude Fable 5 <noreply@anthropic.com>
Claude-Session: https://claude.ai/code/session_01LikXTiVDyR24xCRvYkrPvc
</commit_message>
<xml_diff>
--- a/docs/Money_Management_Assessment_TX_Flow_Review.docx
+++ b/docs/Money_Management_Assessment_TX_Flow_Review.docx
@@ -21,7 +21,7 @@
         </w:rPr>
         <w:t>Screen Flow review — findings and optimization recommendations</w:t>
         <w:br/>
-        <w:t>Flow API Version 63.0  |  Review date: July 3, 2026 (rev. 2 — F-1 closed after debug verification)  |  Reviewed against: current org metadata (XML)</w:t>
+        <w:t>Flow API Version 63.0  |  Review date: July 3, 2026 (rev. 3 — F-1 closed; F-6 expanded with declarative alternative)  |  Reviewed against: current org metadata (XML)</w:t>
       </w:r>
     </w:p>
     <w:p>
@@ -553,9 +553,9 @@
       <w:r>
         <w:rPr>
           <w:b/>
-          <w:color w:val="2E7D32"/>
+          <w:color w:val="B56A00"/>
         </w:rPr>
-        <w:t>LOW — maintenance cost, acceptable trade-off</w:t>
+        <w:t>MEDIUM — design discussion; declarative alternative recommended</w:t>
       </w:r>
     </w:p>
     <w:p>
@@ -564,7 +564,141 @@
           <w:b w:val="0"/>
           <w:i w:val="0"/>
         </w:rPr>
-        <w:t>The confirmation page is a full disabled copy of the input screen: every field, choice reference, validation and visibility rule exists twice. This is a standard declarative pattern for a review screen and does not need to change — but note that F-4 is exactly the kind of bug this duplication breeds. Every future question change must be made in both screens. If the form keeps growing, consider a display-only summary (Display Text table or a small LWC) instead of duplicated disabled inputs.</w:t>
+        <w:t>Design intent (confirmed with the flow owner): the confirmation page is not just a review screen — it is the completeness gate. Fields on the editable screen are optional so a partial draft can be saved; the same fields on the confirmation page are disabled AND required, so "Generate Document" is blocked until every question has an answer. This is a legitimate declarative pattern and it works today.</w:t>
+      </w:r>
+    </w:p>
+    <w:p>
+      <w:r>
+        <w:rPr>
+          <w:b w:val="0"/>
+          <w:i w:val="0"/>
+        </w:rPr>
+        <w:t>Trade-offs of the current approach:</w:t>
+      </w:r>
+    </w:p>
+    <w:p>
+      <w:pPr>
+        <w:pStyle w:val="ListBullet"/>
+      </w:pPr>
+      <w:r>
+        <w:t>Dual maintenance: every question, choice, validation and visibility rule exists twice and must be edited twice. Finding F-4 (mixed visibility-rule references) is a direct symptom.</w:t>
+      </w:r>
+    </w:p>
+    <w:p>
+      <w:pPr>
+        <w:pStyle w:val="ListBullet"/>
+      </w:pPr>
+      <w:r>
+        <w:t>User experience: when a required answer is missing, the error appears on a field the user cannot edit. They must click Back/Edit and hunt for the blanks themselves.</w:t>
+      </w:r>
+    </w:p>
+    <w:p>
+      <w:pPr>
+        <w:pStyle w:val="ListBullet"/>
+      </w:pPr>
+      <w:r>
+        <w:t>Fragility: the gate relies on Flow firing required-field validation on DISABLED inputs. This behavior is undocumented; a future Salesforce release could change it and the submission gate would silently stop enforcing completeness.</w:t>
+      </w:r>
+    </w:p>
+    <w:p>
+      <w:r>
+        <w:rPr>
+          <w:b/>
+          <w:i w:val="0"/>
+        </w:rPr>
+        <w:t>Recommended declarative alternative (no LWC, no code): replace the duplicated required screen with a Decision-based completeness gate plus a Display Text review screen.</w:t>
+      </w:r>
+    </w:p>
+    <w:p>
+      <w:r>
+        <w:rPr>
+          <w:rFonts w:ascii="Consolas" w:hAnsi="Consolas"/>
+          <w:sz w:val="18"/>
+        </w:rPr>
+        <w:t>ScreenFlow [Save &amp; Continue]</w:t>
+        <w:br/>
+        <w:t xml:space="preserve">  -&gt; Update_Record_Variables -&gt; Update_Record_One   (draft saved, unchanged)</w:t>
+        <w:br/>
+        <w:t xml:space="preserve">  -&gt; Check_Form_Complete  (Decision)</w:t>
+        <w:br/>
+        <w:t xml:space="preserve">       |- Complete   -&gt; Review_Screen (Display Text summary,</w:t>
+        <w:br/>
+        <w:t xml:space="preserve">       |                 Next = 'Generate Document')</w:t>
+        <w:br/>
+        <w:t xml:space="preserve">       |                 -&gt; Update_Status_Variable -&gt; Update_Record -&gt; Confirmation</w:t>
+        <w:br/>
+        <w:t xml:space="preserve">       |- Incomplete -&gt; Incomplete_Screen: 'Your draft has been saved. To generate</w:t>
+        <w:br/>
+        <w:t xml:space="preserve">                        the document, please answer: {!MissingQuestionsList}'</w:t>
+        <w:br/>
+        <w:t xml:space="preserve">                        (Back returns to the form; Finish exits with draft intact)</w:t>
+      </w:r>
+    </w:p>
+    <w:p>
+      <w:r>
+        <w:rPr>
+          <w:b w:val="0"/>
+          <w:i w:val="0"/>
+        </w:rPr>
+        <w:t>Building blocks (all point-and-click):</w:t>
+      </w:r>
+    </w:p>
+    <w:p>
+      <w:pPr>
+        <w:pStyle w:val="ListBullet"/>
+      </w:pPr>
+      <w:r>
+        <w:t>Check_Form_Complete decision: one 'Complete' outcome with an Is Null = False condition per required answer on form_document_record. Conditional requirements (e.g., Print Name only when 'Other' is selected) become compound conditions such as Text_15__c = 'Other' AND Text_16__c Is Null.</w:t>
+      </w:r>
+    </w:p>
+    <w:p>
+      <w:pPr>
+        <w:pStyle w:val="ListBullet"/>
+      </w:pPr>
+      <w:r>
+        <w:t>MissingQuestionsList formula or Text Template: a chain of IF(ISBLANK(field), '• question label', '') clauses. This upgrades the UX — the user sees a plain list of exactly which questions are still open, instead of red errors on read-only fields.</w:t>
+      </w:r>
+    </w:p>
+    <w:p>
+      <w:pPr>
+        <w:pStyle w:val="ListBullet"/>
+      </w:pPr>
+      <w:r>
+        <w:t>Review screen as Display Text: label + {!form_document_record.Field__c} merge fields. Radio answers are stored as literal 'Yes'/'No' strings, so they display cleanly. Cosmetic caveat: Currency/Number merge fields render unformatted — wrap in TEXT()-based formulas if '$25.00'-style display matters.</w:t>
+      </w:r>
+    </w:p>
+    <w:p>
+      <w:r>
+        <w:rPr>
+          <w:b w:val="0"/>
+          <w:i w:val="0"/>
+        </w:rPr>
+        <w:t>Side benefits of the restructure:</w:t>
+      </w:r>
+    </w:p>
+    <w:p>
+      <w:pPr>
+        <w:pStyle w:val="ListBullet"/>
+      </w:pPr>
+      <w:r>
+        <w:t>F-4 is eliminated — there are no duplicated visibility rules left to drift.</w:t>
+      </w:r>
+    </w:p>
+    <w:p>
+      <w:pPr>
+        <w:pStyle w:val="ListBullet"/>
+      </w:pPr>
+      <w:r>
+        <w:t>Draft-only exit improves: today a user who only wants to save a draft still lands on the confirmation page, whose only forward button is 'Generate Document', and must abandon the window to stop. The Incomplete screen ends cleanly with Finish. Optionally, add a 'What would you like to do?' radio (Save as draft / Submit for generation) on the main screen and branch on it, so even users with a complete form can exit as draft deliberately.</w:t>
+      </w:r>
+    </w:p>
+    <w:p>
+      <w:r>
+        <w:rPr>
+          <w:b w:val="0"/>
+          <w:i/>
+        </w:rPr>
+        <w:t>Keeping the current design is defensible — it is declarative and functioning. If it is kept, fix F-4 and document (in the flow description) that the disabled+required confirmation fields are the completeness gate, so a future admin does not 'clean up' the required flags.</w:t>
       </w:r>
     </w:p>
     <w:p>
@@ -929,7 +1063,49 @@
           </w:tcPr>
           <w:p>
             <w:r>
-              <w:t>F-6 / F-7  Housekeeping items</w:t>
+              <w:t>F-6  Replace duplicated confirmation screen with decision gate + Display Text review</w:t>
+            </w:r>
+          </w:p>
+        </w:tc>
+        <w:tc>
+          <w:tcPr>
+            <w:tcW w:type="dxa" w:w="2160"/>
+          </w:tcPr>
+          <w:p>
+            <w:r>
+              <w:t>Medium</w:t>
+            </w:r>
+          </w:p>
+        </w:tc>
+        <w:tc>
+          <w:tcPr>
+            <w:tcW w:type="dxa" w:w="2160"/>
+          </w:tcPr>
+          <w:p>
+            <w:r>
+              <w:t>Dual maintenance; undocumented-behavior reliance</w:t>
+            </w:r>
+          </w:p>
+        </w:tc>
+      </w:tr>
+      <w:tr>
+        <w:tc>
+          <w:tcPr>
+            <w:tcW w:type="dxa" w:w="2160"/>
+          </w:tcPr>
+          <w:p>
+            <w:r>
+              <w:t>7</w:t>
+            </w:r>
+          </w:p>
+        </w:tc>
+        <w:tc>
+          <w:tcPr>
+            <w:tcW w:type="dxa" w:w="2160"/>
+          </w:tcPr>
+          <w:p>
+            <w:r>
+              <w:t>F-7  Housekeeping items</w:t>
             </w:r>
           </w:p>
         </w:tc>

</xml_diff>